<commit_message>
POL-003 v1.1: add corrective action plan + sanction-outcome documentation
Close the two SRA Q19 gaps in the sanction process (§4.5): a formal corrective
action plan for serious/repeat violations (remediation steps, owner, due date)
and documentation of the sanction outcome on completion. Now covers all five
Q19 elements. Bumped to v1.1, re-approved (Raja Gopalan / Security Officer /
2026-06-16); approval + review-history tables keep the 1.0->1.1 trail; REGISTER
updated to v1.1. This commit is the v1.1 approval evidence.
</commit_message>
<xml_diff>
--- a/Compliance/workforce-security-sanction-policy.docx
+++ b/Compliance/workforce-security-sanction-policy.docx
@@ -105,7 +105,7 @@
           </w:tcPr>
           <w:p>
             <w:r>
-              <w:t>1.0</w:t>
+              <w:t>1.1</w:t>
             </w:r>
           </w:p>
         </w:tc>
@@ -422,6 +422,14 @@
     </w:p>
     <w:p>
       <w:pPr>
+        <w:pStyle w:val="ListNumber"/>
+      </w:pPr>
+      <w:r>
+        <w:t>Serious or repeat violations receive a formal corrective action plan, and the outcome of every sanction is documented.</w:t>
+      </w:r>
+    </w:p>
+    <w:p>
+      <w:pPr>
         <w:pStyle w:val="Heading2"/>
       </w:pPr>
       <w:r>
@@ -606,17 +614,14 @@
         <w:pStyle w:val="ListNumber"/>
       </w:pPr>
       <w:r>
-        <w:t xml:space="preserve">The Security Officer investigates and </w:t>
+        <w:t>The Security Officer investigates and documents the findings, including the reason for the sanction.</w:t>
       </w:r>
       <w:r>
         <w:rPr>
           <w:b/>
         </w:rPr>
-        <w:t>documents</w:t>
       </w:r>
-      <w:r>
-        <w:t xml:space="preserve"> the findings.</w:t>
-      </w:r>
+      <w:r/>
     </w:p>
     <w:p>
       <w:pPr>
@@ -641,6 +646,22 @@
       </w:pPr>
       <w:r>
         <w:t>The action is recorded in the member's file and retained.</w:t>
+      </w:r>
+    </w:p>
+    <w:p>
+      <w:pPr>
+        <w:pStyle w:val="ListNumber"/>
+      </w:pPr>
+      <w:r>
+        <w:t>For serious or repeat violations, the Security Officer issues a formal corrective action plan — the required remediation steps, a responsible owner, and a due date — and tracks it to completion.</w:t>
+      </w:r>
+    </w:p>
+    <w:p>
+      <w:pPr>
+        <w:pStyle w:val="ListNumber"/>
+      </w:pPr>
+      <w:r>
+        <w:t>Once the sanction and any corrective action are completed, their outcome is documented (action taken, result, and completion date) in the member's file.</w:t>
       </w:r>
     </w:p>
     <w:p>
@@ -1387,6 +1408,58 @@
           </w:p>
         </w:tc>
       </w:tr>
+      <w:tr>
+        <w:tc>
+          <w:tcPr>
+            <w:tcW w:type="dxa" w:w="1728"/>
+          </w:tcPr>
+          <w:p>
+            <w:r>
+              <w:t>1.1</w:t>
+            </w:r>
+          </w:p>
+        </w:tc>
+        <w:tc>
+          <w:tcPr>
+            <w:tcW w:type="dxa" w:w="1728"/>
+          </w:tcPr>
+          <w:p>
+            <w:r>
+              <w:t>2026-06-16</w:t>
+            </w:r>
+          </w:p>
+        </w:tc>
+        <w:tc>
+          <w:tcPr>
+            <w:tcW w:type="dxa" w:w="1728"/>
+          </w:tcPr>
+          <w:p>
+            <w:r>
+              <w:t>Raja Gopalan</w:t>
+            </w:r>
+          </w:p>
+        </w:tc>
+        <w:tc>
+          <w:tcPr>
+            <w:tcW w:type="dxa" w:w="1728"/>
+          </w:tcPr>
+          <w:p>
+            <w:r>
+              <w:t>Added corrective action plan + sanction-outcome documentation (Q19)</w:t>
+            </w:r>
+          </w:p>
+        </w:tc>
+        <w:tc>
+          <w:tcPr>
+            <w:tcW w:type="dxa" w:w="1728"/>
+          </w:tcPr>
+          <w:p>
+            <w:r>
+              <w:t>Raja Gopalan</w:t>
+            </w:r>
+          </w:p>
+        </w:tc>
+      </w:tr>
     </w:tbl>
     <w:p/>
     <w:p>
@@ -1491,6 +1564,48 @@
           <w:p>
             <w:r>
               <w:t>1.0</w:t>
+            </w:r>
+          </w:p>
+        </w:tc>
+        <w:tc>
+          <w:tcPr>
+            <w:tcW w:type="dxa" w:w="2160"/>
+          </w:tcPr>
+          <w:p>
+            <w:r>
+              <w:t>Raja Gopalan</w:t>
+            </w:r>
+          </w:p>
+        </w:tc>
+        <w:tc>
+          <w:tcPr>
+            <w:tcW w:type="dxa" w:w="2160"/>
+          </w:tcPr>
+          <w:p>
+            <w:r>
+              <w:t>Security Officer</w:t>
+            </w:r>
+          </w:p>
+        </w:tc>
+        <w:tc>
+          <w:tcPr>
+            <w:tcW w:type="dxa" w:w="2160"/>
+          </w:tcPr>
+          <w:p>
+            <w:r>
+              <w:t>2026-06-16</w:t>
+            </w:r>
+          </w:p>
+        </w:tc>
+      </w:tr>
+      <w:tr>
+        <w:tc>
+          <w:tcPr>
+            <w:tcW w:type="dxa" w:w="2160"/>
+          </w:tcPr>
+          <w:p>
+            <w:r>
+              <w:t>1.1</w:t>
             </w:r>
           </w:p>
         </w:tc>

</xml_diff>